<commit_message>
CTF : bips de départ et de fin toujours actifs
Les bips de début et de fin de partie CTF ne dépendent plus du réglage
« Bip CTF ». Ce réglage ne servait plus à rien : il est retiré, le menu
CTF passe à 3 paramètres (Timer partie, Timer capture, Délai début).
Notice et tests de simulation mis à jour.

Co-Authored-By: Claude Opus 5.5 (1M context) <noreply@anthropic.com>
Claude-Session: https://claude.ai/code/session_016tP2Fq953aHPe86vrRBryh
</commit_message>
<xml_diff>
--- a/notice/Mode_emploi_Bombe.docx
+++ b/notice/Mode_emploi_Bombe.docx
@@ -4537,7 +4537,7 @@
         <w:tc>
           <w:tcPr>
             <w:tcW w:type="dxa" w:w="600"/>
-            <w:shd w:fill="FFFFFF" w:color="auto" w:val="clear"/>
+            <w:shd w:fill="E8F0FB" w:color="auto" w:val="clear"/>
             <w:tcMar>
               <w:top w:type="dxa" w:w="80"/>
               <w:left w:type="dxa" w:w="160"/>
@@ -4561,128 +4561,6 @@
                 <w:szCs w:val="20"/>
               </w:rPr>
               <w:t xml:space="preserve">3</w:t>
-            </w:r>
-          </w:p>
-        </w:tc>
-        <w:tc>
-          <w:tcPr>
-            <w:tcW w:type="dxa" w:w="3300"/>
-            <w:shd w:fill="FFFFFF" w:color="auto" w:val="clear"/>
-            <w:tcMar>
-              <w:top w:type="dxa" w:w="80"/>
-              <w:left w:type="dxa" w:w="160"/>
-              <w:bottom w:type="dxa" w:w="80"/>
-              <w:right w:type="dxa" w:w="160"/>
-            </w:tcMar>
-            <w:vAlign w:val="center"/>
-          </w:tcPr>
-          <w:p>
-            <w:pPr>
-              <w:spacing w:line="276"/>
-            </w:pPr>
-            <w:r>
-              <w:rPr>
-                <w:rFonts w:ascii="Arial" w:cs="Arial" w:eastAsia="Arial" w:hAnsi="Arial"/>
-                <w:b w:val="false"/>
-                <w:bCs w:val="false"/>
-                <w:color w:val="1F2328"/>
-                <w:sz w:val="20"/>
-                <w:szCs w:val="20"/>
-              </w:rPr>
-              <w:t xml:space="preserve">Bip CTF</w:t>
-            </w:r>
-          </w:p>
-        </w:tc>
-        <w:tc>
-          <w:tcPr>
-            <w:tcW w:type="dxa" w:w="1900"/>
-            <w:shd w:fill="FFFFFF" w:color="auto" w:val="clear"/>
-            <w:tcMar>
-              <w:top w:type="dxa" w:w="80"/>
-              <w:left w:type="dxa" w:w="160"/>
-              <w:bottom w:type="dxa" w:w="80"/>
-              <w:right w:type="dxa" w:w="160"/>
-            </w:tcMar>
-            <w:vAlign w:val="center"/>
-          </w:tcPr>
-          <w:p>
-            <w:pPr>
-              <w:spacing w:line="276"/>
-            </w:pPr>
-            <w:r>
-              <w:rPr>
-                <w:rFonts w:ascii="Arial" w:cs="Arial" w:eastAsia="Arial" w:hAnsi="Arial"/>
-                <w:b/>
-                <w:bCs/>
-                <w:color w:val="1F2328"/>
-                <w:sz w:val="20"/>
-                <w:szCs w:val="20"/>
-              </w:rPr>
-              <w:t xml:space="preserve">OUI</w:t>
-            </w:r>
-          </w:p>
-        </w:tc>
-        <w:tc>
-          <w:tcPr>
-            <w:tcW w:type="dxa" w:w="4666"/>
-            <w:shd w:fill="FFFFFF" w:color="auto" w:val="clear"/>
-            <w:tcMar>
-              <w:top w:type="dxa" w:w="80"/>
-              <w:left w:type="dxa" w:w="160"/>
-              <w:bottom w:type="dxa" w:w="80"/>
-              <w:right w:type="dxa" w:w="160"/>
-            </w:tcMar>
-            <w:vAlign w:val="center"/>
-          </w:tcPr>
-          <w:p>
-            <w:pPr>
-              <w:spacing w:line="276"/>
-            </w:pPr>
-            <w:r>
-              <w:rPr>
-                <w:rFonts w:ascii="Arial" w:cs="Arial" w:eastAsia="Arial" w:hAnsi="Arial"/>
-                <w:b w:val="false"/>
-                <w:bCs w:val="false"/>
-                <w:color w:val="1F2328"/>
-                <w:sz w:val="20"/>
-                <w:szCs w:val="20"/>
-              </w:rPr>
-              <w:t xml:space="preserve">Bip au départ (1 s) et à la fin (2 s) de la partie.</w:t>
-            </w:r>
-          </w:p>
-        </w:tc>
-      </w:tr>
-      <w:tr>
-        <w:trPr>
-          <w:cantSplit/>
-        </w:trPr>
-        <w:tc>
-          <w:tcPr>
-            <w:tcW w:type="dxa" w:w="600"/>
-            <w:shd w:fill="E8F0FB" w:color="auto" w:val="clear"/>
-            <w:tcMar>
-              <w:top w:type="dxa" w:w="80"/>
-              <w:left w:type="dxa" w:w="160"/>
-              <w:bottom w:type="dxa" w:w="80"/>
-              <w:right w:type="dxa" w:w="160"/>
-            </w:tcMar>
-            <w:vAlign w:val="center"/>
-          </w:tcPr>
-          <w:p>
-            <w:pPr>
-              <w:spacing w:line="276"/>
-              <w:jc w:val="center"/>
-            </w:pPr>
-            <w:r>
-              <w:rPr>
-                <w:rFonts w:ascii="Arial" w:cs="Arial" w:eastAsia="Arial" w:hAnsi="Arial"/>
-                <w:b/>
-                <w:bCs/>
-                <w:color w:val="1F2328"/>
-                <w:sz w:val="20"/>
-                <w:szCs w:val="20"/>
-              </w:rPr>
-              <w:t xml:space="preserve">4</w:t>
             </w:r>
           </w:p>
         </w:tc>
@@ -7878,7 +7756,7 @@
                 <w:sz w:val="20"/>
                 <w:szCs w:val="20"/>
               </w:rPr>
-              <w:t xml:space="preserve">Vérifiez le réglage « Bip » du mode (Bip bombe, Bip CTF, Bip patate ou Bip mine).</w:t>
+              <w:t xml:space="preserve">Vérifiez le réglage « Bip » du mode (Bip bombe, Bip patate ou Bip mine). En CTF, les bips de départ et de fin sonnent toujours.</w:t>
             </w:r>
           </w:p>
         </w:tc>

</xml_diff>